<commit_message>
Update Blood Bank Management System document images
</commit_message>
<xml_diff>
--- a/Blood Bank Management System/Blood Bank Management System.docx
+++ b/Blood Bank Management System/Blood Bank Management System.docx
@@ -889,9 +889,9 @@
           <w:noProof/>
         </w:rPr>
         <w:drawing>
-          <wp:inline distT="0" distB="0" distL="0" distR="0" wp14:anchorId="26DC0ED6" wp14:editId="72F4F6E3">
-            <wp:extent cx="5038894" cy="7437481"/>
-            <wp:effectExtent l="0" t="0" r="0" b="0"/>
+          <wp:inline distT="0" distB="0" distL="0" distR="0" wp14:anchorId="26DC0ED6" wp14:editId="59BF63CF">
+            <wp:extent cx="6020673" cy="5231757"/>
+            <wp:effectExtent l="0" t="0" r="0" b="1270"/>
             <wp:docPr id="352461668" name="Picture 3"/>
             <wp:cNvGraphicFramePr>
               <a:graphicFrameLocks xmlns:a="http://schemas.openxmlformats.org/drawingml/2006/main" noChangeAspect="1"/>
@@ -905,13 +905,6 @@
                   </pic:nvPicPr>
                   <pic:blipFill>
                     <a:blip r:embed="rId5">
-                      <a:duotone>
-                        <a:prstClr val="black"/>
-                        <a:schemeClr val="accent2">
-                          <a:tint val="45000"/>
-                          <a:satMod val="400000"/>
-                        </a:schemeClr>
-                      </a:duotone>
                       <a:extLst>
                         <a:ext uri="{28A0092B-C50C-407E-A947-70E740481C1C}">
                           <a14:useLocalDpi xmlns:a14="http://schemas.microsoft.com/office/drawing/2010/main" val="0"/>
@@ -925,7 +918,7 @@
                   <pic:spPr>
                     <a:xfrm>
                       <a:off x="0" y="0"/>
-                      <a:ext cx="5038894" cy="7437481"/>
+                      <a:ext cx="6049461" cy="5256773"/>
                     </a:xfrm>
                     <a:prstGeom prst="rect">
                       <a:avLst/>
@@ -1282,6 +1275,7 @@
     <w:p>
       <w:pPr>
         <w:pStyle w:val="FirstParagraph"/>
+        <w:spacing w:before="0" w:after="0"/>
         <w:jc w:val="both"/>
         <w:rPr>
           <w:rFonts w:ascii="Times New Roman" w:hAnsi="Times New Roman" w:cs="Times New Roman"/>
@@ -1302,6 +1296,7 @@
           <w:ilvl w:val="0"/>
           <w:numId w:val="9"/>
         </w:numPr>
+        <w:spacing w:after="0"/>
         <w:jc w:val="both"/>
         <w:rPr>
           <w:rFonts w:ascii="Times New Roman" w:hAnsi="Times New Roman" w:cs="Times New Roman"/>
@@ -1320,6 +1315,7 @@
           <w:ilvl w:val="0"/>
           <w:numId w:val="9"/>
         </w:numPr>
+        <w:spacing w:after="0"/>
         <w:jc w:val="both"/>
         <w:rPr>
           <w:rFonts w:ascii="Times New Roman" w:hAnsi="Times New Roman" w:cs="Times New Roman"/>
@@ -1335,6 +1331,7 @@
     <w:p>
       <w:pPr>
         <w:pStyle w:val="FirstParagraph"/>
+        <w:spacing w:before="0" w:after="0"/>
         <w:jc w:val="both"/>
         <w:rPr>
           <w:rFonts w:ascii="Times New Roman" w:hAnsi="Times New Roman" w:cs="Times New Roman"/>
@@ -1355,6 +1352,7 @@
           <w:ilvl w:val="0"/>
           <w:numId w:val="10"/>
         </w:numPr>
+        <w:spacing w:after="0"/>
         <w:jc w:val="both"/>
         <w:rPr>
           <w:rFonts w:ascii="Times New Roman" w:hAnsi="Times New Roman" w:cs="Times New Roman"/>
@@ -1373,6 +1371,7 @@
           <w:ilvl w:val="0"/>
           <w:numId w:val="10"/>
         </w:numPr>
+        <w:spacing w:after="0"/>
         <w:jc w:val="both"/>
         <w:rPr>
           <w:rFonts w:ascii="Times New Roman" w:hAnsi="Times New Roman" w:cs="Times New Roman"/>
@@ -1388,6 +1387,7 @@
     <w:p>
       <w:pPr>
         <w:pStyle w:val="FirstParagraph"/>
+        <w:spacing w:before="0" w:after="0"/>
         <w:jc w:val="both"/>
         <w:rPr>
           <w:rFonts w:ascii="Times New Roman" w:hAnsi="Times New Roman" w:cs="Times New Roman"/>
@@ -1408,6 +1408,7 @@
           <w:ilvl w:val="0"/>
           <w:numId w:val="11"/>
         </w:numPr>
+        <w:spacing w:after="0"/>
         <w:jc w:val="both"/>
         <w:rPr>
           <w:rFonts w:ascii="Times New Roman" w:hAnsi="Times New Roman" w:cs="Times New Roman"/>
@@ -1423,6 +1424,7 @@
     <w:p>
       <w:pPr>
         <w:pStyle w:val="FirstParagraph"/>
+        <w:spacing w:before="0" w:after="0"/>
         <w:jc w:val="both"/>
         <w:rPr>
           <w:rFonts w:ascii="Times New Roman" w:hAnsi="Times New Roman" w:cs="Times New Roman"/>
@@ -1443,6 +1445,7 @@
           <w:ilvl w:val="0"/>
           <w:numId w:val="12"/>
         </w:numPr>
+        <w:spacing w:after="0"/>
         <w:jc w:val="both"/>
         <w:rPr>
           <w:rFonts w:ascii="Times New Roman" w:hAnsi="Times New Roman" w:cs="Times New Roman"/>
@@ -1458,6 +1461,7 @@
     <w:p>
       <w:pPr>
         <w:pStyle w:val="FirstParagraph"/>
+        <w:spacing w:before="0" w:after="0"/>
         <w:jc w:val="both"/>
         <w:rPr>
           <w:rFonts w:ascii="Times New Roman" w:hAnsi="Times New Roman" w:cs="Times New Roman"/>
@@ -1478,22 +1482,23 @@
           <w:ilvl w:val="0"/>
           <w:numId w:val="13"/>
         </w:numPr>
-        <w:jc w:val="both"/>
-        <w:rPr>
-          <w:rFonts w:ascii="Times New Roman" w:hAnsi="Times New Roman" w:cs="Times New Roman"/>
-        </w:rPr>
-      </w:pPr>
-      <w:r>
-        <w:rPr>
-          <w:rFonts w:ascii="Times New Roman" w:hAnsi="Times New Roman" w:cs="Times New Roman"/>
-        </w:rPr>
-        <w:lastRenderedPageBreak/>
+        <w:spacing w:after="0"/>
+        <w:jc w:val="both"/>
+        <w:rPr>
+          <w:rFonts w:ascii="Times New Roman" w:hAnsi="Times New Roman" w:cs="Times New Roman"/>
+        </w:rPr>
+      </w:pPr>
+      <w:r>
+        <w:rPr>
+          <w:rFonts w:ascii="Times New Roman" w:hAnsi="Times New Roman" w:cs="Times New Roman"/>
+        </w:rPr>
         <w:t>Attributes: donation_date, quantity</w:t>
       </w:r>
     </w:p>
     <w:p>
       <w:pPr>
         <w:pStyle w:val="FirstParagraph"/>
+        <w:spacing w:before="0" w:after="0"/>
         <w:jc w:val="both"/>
         <w:rPr>
           <w:rFonts w:ascii="Times New Roman" w:hAnsi="Times New Roman" w:cs="Times New Roman"/>
@@ -1514,6 +1519,7 @@
           <w:ilvl w:val="0"/>
           <w:numId w:val="14"/>
         </w:numPr>
+        <w:spacing w:after="0"/>
         <w:jc w:val="both"/>
         <w:rPr>
           <w:rFonts w:ascii="Times New Roman" w:hAnsi="Times New Roman" w:cs="Times New Roman"/>
@@ -1529,6 +1535,7 @@
     <w:p>
       <w:pPr>
         <w:pStyle w:val="FirstParagraph"/>
+        <w:spacing w:before="0" w:after="0"/>
         <w:jc w:val="both"/>
         <w:rPr>
           <w:rFonts w:ascii="Times New Roman" w:hAnsi="Times New Roman" w:cs="Times New Roman"/>
@@ -1549,6 +1556,7 @@
           <w:ilvl w:val="0"/>
           <w:numId w:val="15"/>
         </w:numPr>
+        <w:spacing w:after="0"/>
         <w:jc w:val="both"/>
         <w:rPr>
           <w:rFonts w:ascii="Times New Roman" w:hAnsi="Times New Roman" w:cs="Times New Roman"/>
@@ -1577,6 +1585,7 @@
           <w:b/>
           <w:bCs/>
         </w:rPr>
+        <w:lastRenderedPageBreak/>
         <w:t>Class Diagram</w:t>
       </w:r>
     </w:p>
@@ -1589,9 +1598,9 @@
           <w:noProof/>
         </w:rPr>
         <w:drawing>
-          <wp:inline distT="0" distB="0" distL="0" distR="0" wp14:anchorId="2FCFCD28" wp14:editId="0BA10C90">
-            <wp:extent cx="4271058" cy="6669875"/>
-            <wp:effectExtent l="0" t="0" r="0" b="0"/>
+          <wp:inline distT="0" distB="0" distL="0" distR="0" wp14:anchorId="2FCFCD28" wp14:editId="5E931D25">
+            <wp:extent cx="4568406" cy="8333772"/>
+            <wp:effectExtent l="0" t="0" r="3810" b="0"/>
             <wp:docPr id="775221616" name="Picture 4"/>
             <wp:cNvGraphicFramePr>
               <a:graphicFrameLocks xmlns:a="http://schemas.openxmlformats.org/drawingml/2006/main" noChangeAspect="1"/>
@@ -1618,7 +1627,7 @@
                   <pic:spPr>
                     <a:xfrm>
                       <a:off x="0" y="0"/>
-                      <a:ext cx="4426043" cy="6911907"/>
+                      <a:ext cx="4618073" cy="8424376"/>
                     </a:xfrm>
                     <a:prstGeom prst="rect">
                       <a:avLst/>
@@ -1633,14 +1642,6 @@
     </w:p>
     <w:p>
       <w:pPr>
-        <w:jc w:val="both"/>
-        <w:rPr>
-          <w:rFonts w:ascii="Times New Roman" w:hAnsi="Times New Roman" w:cs="Times New Roman"/>
-        </w:rPr>
-      </w:pPr>
-    </w:p>
-    <w:p>
-      <w:pPr>
         <w:pStyle w:val="Heading2"/>
         <w:jc w:val="both"/>
         <w:rPr>
@@ -2512,8 +2513,8 @@
           <w:noProof/>
         </w:rPr>
         <w:drawing>
-          <wp:inline distT="0" distB="0" distL="0" distR="0" wp14:anchorId="087B189E" wp14:editId="4F64254D">
-            <wp:extent cx="5730240" cy="3244850"/>
+          <wp:inline distT="0" distB="0" distL="0" distR="0" wp14:anchorId="087B189E" wp14:editId="342DA4DB">
+            <wp:extent cx="5613578" cy="6101715"/>
             <wp:effectExtent l="0" t="0" r="0" b="0"/>
             <wp:docPr id="1294814328" name="Picture 5"/>
             <wp:cNvGraphicFramePr>
@@ -2541,7 +2542,7 @@
                   <pic:spPr>
                     <a:xfrm>
                       <a:off x="0" y="0"/>
-                      <a:ext cx="5730240" cy="3244850"/>
+                      <a:ext cx="5658199" cy="6150217"/>
                     </a:xfrm>
                     <a:prstGeom prst="rect">
                       <a:avLst/>

</xml_diff>

<commit_message>
Update Blood Bank Management System document
</commit_message>
<xml_diff>
--- a/Blood Bank Management System/Blood Bank Management System.docx
+++ b/Blood Bank Management System/Blood Bank Management System.docx
@@ -2564,6 +2564,76 @@
       <w:r>
         <w:rPr>
           <w:rFonts w:ascii="Times New Roman" w:hAnsi="Times New Roman" w:cs="Times New Roman"/>
+        </w:rPr>
+        <w:br w:type="page"/>
+      </w:r>
+    </w:p>
+    <w:p>
+      <w:pPr>
+        <w:rPr>
+          <w:rFonts w:ascii="Times New Roman" w:eastAsiaTheme="majorEastAsia" w:hAnsi="Times New Roman" w:cs="Times New Roman"/>
+          <w:b/>
+          <w:bCs/>
+          <w:color w:val="0F4761" w:themeColor="accent1" w:themeShade="BF"/>
+          <w:sz w:val="32"/>
+          <w:szCs w:val="32"/>
+        </w:rPr>
+      </w:pPr>
+      <w:r>
+        <w:rPr>
+          <w:rFonts w:ascii="Times New Roman" w:hAnsi="Times New Roman" w:cs="Times New Roman"/>
+          <w:b/>
+          <w:bCs/>
+          <w:noProof/>
+        </w:rPr>
+        <w:lastRenderedPageBreak/>
+        <w:drawing>
+          <wp:inline distT="0" distB="0" distL="0" distR="0" wp14:anchorId="0FD6E9DA" wp14:editId="27A6C5DB">
+            <wp:extent cx="7853558" cy="4978968"/>
+            <wp:effectExtent l="2223" t="0" r="0" b="0"/>
+            <wp:docPr id="65870750" name="Picture 1"/>
+            <wp:cNvGraphicFramePr>
+              <a:graphicFrameLocks xmlns:a="http://schemas.openxmlformats.org/drawingml/2006/main" noChangeAspect="1"/>
+            </wp:cNvGraphicFramePr>
+            <a:graphic xmlns:a="http://schemas.openxmlformats.org/drawingml/2006/main">
+              <a:graphicData uri="http://schemas.openxmlformats.org/drawingml/2006/picture">
+                <pic:pic xmlns:pic="http://schemas.openxmlformats.org/drawingml/2006/picture">
+                  <pic:nvPicPr>
+                    <pic:cNvPr id="65870750" name="Picture 65870750"/>
+                    <pic:cNvPicPr/>
+                  </pic:nvPicPr>
+                  <pic:blipFill>
+                    <a:blip r:embed="rId8">
+                      <a:extLst>
+                        <a:ext uri="{28A0092B-C50C-407E-A947-70E740481C1C}">
+                          <a14:useLocalDpi xmlns:a14="http://schemas.microsoft.com/office/drawing/2010/main" val="0"/>
+                        </a:ext>
+                      </a:extLst>
+                    </a:blip>
+                    <a:stretch>
+                      <a:fillRect/>
+                    </a:stretch>
+                  </pic:blipFill>
+                  <pic:spPr>
+                    <a:xfrm rot="16200000">
+                      <a:off x="0" y="0"/>
+                      <a:ext cx="7971817" cy="5053942"/>
+                    </a:xfrm>
+                    <a:prstGeom prst="rect">
+                      <a:avLst/>
+                    </a:prstGeom>
+                  </pic:spPr>
+                </pic:pic>
+              </a:graphicData>
+            </a:graphic>
+          </wp:inline>
+        </w:drawing>
+      </w:r>
+      <w:r>
+        <w:rPr>
+          <w:rFonts w:ascii="Times New Roman" w:hAnsi="Times New Roman" w:cs="Times New Roman"/>
+          <w:b/>
+          <w:bCs/>
         </w:rPr>
         <w:br w:type="page"/>
       </w:r>

</xml_diff>